<commit_message>
Final Commit Before Evaluation 2
</commit_message>
<xml_diff>
--- a/ID-RSS/demo_files/student_0001.docx
+++ b/ID-RSS/demo_files/student_0001.docx
@@ -4,52 +4,7 @@
   <w:body>
     <w:p>
       <w:r>
-        <w:t>Students are required to maintain a minimum attendance of seventy five percent.</w:t>
-      </w:r>
-    </w:p>
-    <w:p>
-      <w:r>
-        <w:t>This document serves as proof of provisional admission to the institution.</w:t>
-      </w:r>
-    </w:p>
-    <w:p>
-      <w:r>
-        <w:t>Name- Divya Mishra</w:t>
-      </w:r>
-    </w:p>
-    <w:p>
-      <w:r>
-        <w:t>Please report to the administrative office for further formalities.</w:t>
-      </w:r>
-    </w:p>
-    <w:p>
-      <w:r>
-        <w:t>Serial No.- STU-2024-0001</w:t>
-      </w:r>
-    </w:p>
-    <w:p>
-      <w:r>
-        <w:t>The hostel allotment will be done on a first come first served basis.</w:t>
-      </w:r>
-    </w:p>
-    <w:p>
-      <w:r>
-        <w:t>The institution reserves the right to cancel admission if documents are found invalid.</w:t>
-      </w:r>
-    </w:p>
-    <w:p>
-      <w:r>
-        <w:t>Identity verification is mandatory at the time of reporting.</w:t>
-      </w:r>
-    </w:p>
-    <w:p>
-      <w:r>
-        <w:t>Fee payment must be completed within seven days of admission.</w:t>
-      </w:r>
-    </w:p>
-    <w:p>
-      <w:r>
-        <w:t>The candidate has successfully completed the online registration process.</w:t>
+        <w:t>Academic records - No identification data present</w:t>
       </w:r>
     </w:p>
     <w:sectPr>

</xml_diff>